<commit_message>
Update literature review and slide citations to follow chronological order (2026-2000)
</commit_message>
<xml_diff>
--- a/presentations/MediGuide_AI_Abstract.docx
+++ b/presentations/MediGuide_AI_Abstract.docx
@@ -1,6 +1,6 @@
 
 <file path=word/document.xml><?xml version="1.0" encoding="utf-8"?>
-<w:document xmlns:wpc="http://schemas.microsoft.com/office/word/2010/wordprocessingCanvas" xmlns:cx="http://schemas.microsoft.com/office/drawing/2014/chartex" xmlns:cx1="http://schemas.microsoft.com/office/drawing/2015/9/8/chartex" xmlns:mc="http://schemas.openxmlformats.org/markup-compatibility/2006" xmlns:o="urn:schemas-microsoft-com:office:office" xmlns:r="http://schemas.openxmlformats.org/officeDocument/2006/relationships" xmlns:m="http://schemas.openxmlformats.org/officeDocument/2006/math" xmlns:v="urn:schemas-microsoft-com:vml" xmlns:wp14="http://schemas.microsoft.com/office/word/2010/wordprocessingDrawing" xmlns:wp="http://schemas.openxmlformats.org/drawingml/2006/wordprocessingDrawing" xmlns:w10="urn:schemas-microsoft-com:office:word" xmlns:w="http://schemas.openxmlformats.org/wordprocessingml/2006/main" xmlns:w14="http://schemas.microsoft.com/office/word/2010/wordml" xmlns:w15="http://schemas.microsoft.com/office/word/2012/wordml" xmlns:w16se="http://schemas.microsoft.com/office/word/2015/wordml/symex" xmlns:wpg="http://schemas.microsoft.com/office/word/2010/wordprocessingGroup" xmlns:wpi="http://schemas.microsoft.com/office/word/2010/wordprocessingInk" xmlns:wne="http://schemas.microsoft.com/office/word/2006/wordml" xmlns:wps="http://schemas.microsoft.com/office/word/2010/wordprocessingShape" mc:Ignorable="w14 w15 w16se wp14">
+<w:document xmlns:wpc="http://schemas.microsoft.com/office/word/2010/wordprocessingCanvas" xmlns:cx="http://schemas.microsoft.com/office/drawing/2014/chartex" xmlns:cx1="http://schemas.microsoft.com/office/drawing/2015/9/8/chartex" xmlns:cx2="http://schemas.microsoft.com/office/drawing/2015/10/21/chartex" xmlns:cx3="http://schemas.microsoft.com/office/drawing/2016/5/9/chartex" xmlns:cx4="http://schemas.microsoft.com/office/drawing/2016/5/10/chartex" xmlns:cx5="http://schemas.microsoft.com/office/drawing/2016/5/11/chartex" xmlns:cx6="http://schemas.microsoft.com/office/drawing/2016/5/12/chartex" xmlns:cx7="http://schemas.microsoft.com/office/drawing/2016/5/13/chartex" xmlns:cx8="http://schemas.microsoft.com/office/drawing/2016/5/14/chartex" xmlns:mc="http://schemas.openxmlformats.org/markup-compatibility/2006" xmlns:aink="http://schemas.microsoft.com/office/drawing/2016/ink" xmlns:am3d="http://schemas.microsoft.com/office/drawing/2017/model3d" xmlns:o="urn:schemas-microsoft-com:office:office" xmlns:oel="http://schemas.microsoft.com/office/2019/extlst" xmlns:r="http://schemas.openxmlformats.org/officeDocument/2006/relationships" xmlns:m="http://schemas.openxmlformats.org/officeDocument/2006/math" xmlns:v="urn:schemas-microsoft-com:vml" xmlns:wp14="http://schemas.microsoft.com/office/word/2010/wordprocessingDrawing" xmlns:wp="http://schemas.openxmlformats.org/drawingml/2006/wordprocessingDrawing" xmlns:w10="urn:schemas-microsoft-com:office:word" xmlns:w="http://schemas.openxmlformats.org/wordprocessingml/2006/main" xmlns:w14="http://schemas.microsoft.com/office/word/2010/wordml" xmlns:w15="http://schemas.microsoft.com/office/word/2012/wordml" xmlns:w16cex="http://schemas.microsoft.com/office/word/2018/wordml/cex" xmlns:w16cid="http://schemas.microsoft.com/office/word/2016/wordml/cid" xmlns:w16="http://schemas.microsoft.com/office/word/2018/wordml" xmlns:w16du="http://schemas.microsoft.com/office/word/2023/wordml/word16du" xmlns:w16sdtdh="http://schemas.microsoft.com/office/word/2020/wordml/sdtdatahash" xmlns:w16sdtfl="http://schemas.microsoft.com/office/word/2024/wordml/sdtformatlock" xmlns:w16se="http://schemas.microsoft.com/office/word/2015/wordml/symex" xmlns:wpg="http://schemas.microsoft.com/office/word/2010/wordprocessingGroup" xmlns:wpi="http://schemas.microsoft.com/office/word/2010/wordprocessingInk" xmlns:wne="http://schemas.microsoft.com/office/word/2006/wordml" xmlns:wps="http://schemas.microsoft.com/office/word/2010/wordprocessingShape" mc:Ignorable="w14 w15 w16se w16cid w16 w16cex w16sdtdh w16sdtfl w16du wp14">
   <w:body>
     <w:p>
       <w:pPr>
@@ -349,6 +349,7 @@
         <w:t>F.No</w:t>
       </w:r>
       <w:proofErr w:type="spellEnd"/>
+      <w:proofErr w:type="gramEnd"/>
       <w:r>
         <w:rPr>
           <w:rFonts w:ascii="Aptos" w:eastAsia="Cambria" w:hAnsi="Aptos" w:cs="Cambria"/>
@@ -357,7 +358,6 @@
         </w:rPr>
         <w:t xml:space="preserve"> :</w:t>
       </w:r>
-      <w:proofErr w:type="gramEnd"/>
       <w:r>
         <w:rPr>
           <w:rFonts w:ascii="Aptos" w:eastAsia="Cambria" w:hAnsi="Aptos" w:cs="Cambria"/>
@@ -656,6 +656,9 @@
             <w:vAlign w:val="center"/>
           </w:tcPr>
           <w:p>
+            <w:pPr>
+              <w:ind w:left="0" w:hanging="2"/>
+            </w:pPr>
             <w:r>
               <w:rPr>
                 <w:rFonts w:ascii="Aptos" w:hAnsi="Aptos"/>
@@ -726,6 +729,9 @@
             <w:vAlign w:val="center"/>
           </w:tcPr>
           <w:p>
+            <w:pPr>
+              <w:ind w:left="0" w:hanging="2"/>
+            </w:pPr>
             <w:r>
               <w:rPr>
                 <w:rFonts w:ascii="Aptos" w:hAnsi="Aptos"/>
@@ -789,6 +795,9 @@
             <w:vAlign w:val="center"/>
           </w:tcPr>
           <w:p>
+            <w:pPr>
+              <w:ind w:left="0" w:hanging="2"/>
+            </w:pPr>
             <w:r>
               <w:rPr>
                 <w:rFonts w:ascii="Aptos" w:hAnsi="Aptos"/>
@@ -883,6 +892,9 @@
             <w:vAlign w:val="center"/>
           </w:tcPr>
           <w:p>
+            <w:pPr>
+              <w:ind w:left="0" w:hanging="2"/>
+            </w:pPr>
             <w:r>
               <w:rPr>
                 <w:rFonts w:ascii="Aptos" w:hAnsi="Aptos"/>
@@ -971,6 +983,9 @@
             <w:vAlign w:val="center"/>
           </w:tcPr>
           <w:p>
+            <w:pPr>
+              <w:ind w:left="0" w:hanging="2"/>
+            </w:pPr>
             <w:r>
               <w:rPr>
                 <w:rFonts w:ascii="Aptos" w:hAnsi="Aptos"/>
@@ -1043,6 +1058,9 @@
             <w:vAlign w:val="center"/>
           </w:tcPr>
           <w:p>
+            <w:pPr>
+              <w:ind w:left="0" w:hanging="2"/>
+            </w:pPr>
             <w:r>
               <w:rPr>
                 <w:rFonts w:ascii="Aptos" w:hAnsi="Aptos"/>
@@ -1106,6 +1124,9 @@
             <w:vAlign w:val="center"/>
           </w:tcPr>
           <w:p>
+            <w:pPr>
+              <w:ind w:left="0" w:hanging="2"/>
+            </w:pPr>
             <w:r>
               <w:rPr>
                 <w:rFonts w:ascii="Aptos" w:hAnsi="Aptos"/>
@@ -1124,18 +1145,159 @@
             <w:vAlign w:val="center"/>
           </w:tcPr>
           <w:p>
+            <w:pPr>
+              <w:ind w:left="0" w:hanging="2"/>
+            </w:pPr>
             <w:r>
               <w:rPr>
                 <w:rFonts w:ascii="Aptos" w:hAnsi="Aptos"/>
                 <w:sz w:val="20"/>
               </w:rPr>
               <w:t>Names &amp; Roll Number of the Students:</w:t>
+            </w:r>
+            <w:r>
+              <w:rPr>
+                <w:rFonts w:ascii="Aptos" w:hAnsi="Aptos"/>
+                <w:sz w:val="20"/>
+              </w:rPr>
               <w:br/>
-              <w:t xml:space="preserve">  - Maruthi Sai Teja   (Roll No: 23ITMNP-B01)</w:t>
+              <w:t xml:space="preserve">  - </w:t>
+            </w:r>
+            <w:r>
+              <w:rPr>
+                <w:rFonts w:ascii="Aptos" w:hAnsi="Aptos"/>
+                <w:sz w:val="20"/>
+              </w:rPr>
+              <w:t>R. Ganesh Reddy</w:t>
+            </w:r>
+            <w:proofErr w:type="gramStart"/>
+            <w:r>
+              <w:rPr>
+                <w:rFonts w:ascii="Aptos" w:hAnsi="Aptos"/>
+                <w:sz w:val="20"/>
+              </w:rPr>
+              <w:t xml:space="preserve">   (</w:t>
+            </w:r>
+            <w:proofErr w:type="gramEnd"/>
+            <w:r>
+              <w:rPr>
+                <w:rFonts w:ascii="Aptos" w:hAnsi="Aptos"/>
+                <w:sz w:val="20"/>
+              </w:rPr>
+              <w:t xml:space="preserve">Roll No: </w:t>
+            </w:r>
+            <w:r>
+              <w:rPr>
+                <w:rFonts w:ascii="Aptos" w:hAnsi="Aptos"/>
+                <w:sz w:val="20"/>
+              </w:rPr>
+              <w:t>23881A12H6</w:t>
+            </w:r>
+            <w:r>
+              <w:rPr>
+                <w:rFonts w:ascii="Aptos" w:hAnsi="Aptos"/>
+                <w:sz w:val="20"/>
+              </w:rPr>
+              <w:t>)</w:t>
+            </w:r>
+            <w:r>
+              <w:rPr>
+                <w:rFonts w:ascii="Aptos" w:hAnsi="Aptos"/>
+                <w:sz w:val="20"/>
+              </w:rPr>
               <w:br/>
-              <w:t xml:space="preserve">  - Student Name 2   (Roll No: Roll No 2)</w:t>
+              <w:t xml:space="preserve">  - </w:t>
+            </w:r>
+            <w:r>
+              <w:rPr>
+                <w:rFonts w:ascii="Aptos" w:hAnsi="Aptos"/>
+                <w:sz w:val="20"/>
+              </w:rPr>
+              <w:t>P.</w:t>
+            </w:r>
+            <w:r>
+              <w:rPr>
+                <w:rFonts w:ascii="Aptos" w:hAnsi="Aptos"/>
+                <w:sz w:val="20"/>
+              </w:rPr>
+              <w:t xml:space="preserve"> </w:t>
+            </w:r>
+            <w:r>
+              <w:rPr>
+                <w:rFonts w:ascii="Aptos" w:hAnsi="Aptos"/>
+                <w:sz w:val="20"/>
+              </w:rPr>
+              <w:t xml:space="preserve">Maruthi Sai Teja </w:t>
+            </w:r>
+            <w:r>
+              <w:rPr>
+                <w:rFonts w:ascii="Aptos" w:hAnsi="Aptos"/>
+                <w:sz w:val="20"/>
+              </w:rPr>
+              <w:t xml:space="preserve">(Roll No: </w:t>
+            </w:r>
+            <w:r>
+              <w:rPr>
+                <w:rFonts w:ascii="Aptos" w:hAnsi="Aptos"/>
+                <w:sz w:val="20"/>
+              </w:rPr>
+              <w:t>23881A12H</w:t>
+            </w:r>
+            <w:r>
+              <w:rPr>
+                <w:rFonts w:ascii="Aptos" w:hAnsi="Aptos"/>
+                <w:sz w:val="20"/>
+              </w:rPr>
+              <w:t>3</w:t>
+            </w:r>
+            <w:r>
+              <w:rPr>
+                <w:rFonts w:ascii="Aptos" w:hAnsi="Aptos"/>
+                <w:sz w:val="20"/>
+              </w:rPr>
+              <w:t>)</w:t>
+            </w:r>
+            <w:r>
+              <w:rPr>
+                <w:rFonts w:ascii="Aptos" w:hAnsi="Aptos"/>
+                <w:sz w:val="20"/>
+              </w:rPr>
               <w:br/>
-              <w:t xml:space="preserve">  - Student Name 3   (Roll No: Roll No 3)</w:t>
+              <w:t xml:space="preserve">  - </w:t>
+            </w:r>
+            <w:r>
+              <w:rPr>
+                <w:rFonts w:ascii="Aptos" w:hAnsi="Aptos"/>
+                <w:sz w:val="20"/>
+              </w:rPr>
+              <w:t xml:space="preserve">P. Pavan Goud </w:t>
+            </w:r>
+            <w:r>
+              <w:rPr>
+                <w:rFonts w:ascii="Aptos" w:hAnsi="Aptos"/>
+                <w:sz w:val="20"/>
+              </w:rPr>
+              <w:t>(Roll No:</w:t>
+            </w:r>
+            <w:r>
+              <w:rPr>
+                <w:rFonts w:ascii="Aptos" w:hAnsi="Aptos"/>
+                <w:sz w:val="20"/>
+              </w:rPr>
+              <w:t xml:space="preserve"> 24885A1219</w:t>
+            </w:r>
+            <w:r>
+              <w:rPr>
+                <w:rFonts w:ascii="Aptos" w:hAnsi="Aptos"/>
+                <w:sz w:val="20"/>
+              </w:rPr>
+              <w:t>)</w:t>
+            </w:r>
+            <w:r>
+              <w:rPr>
+                <w:rFonts w:ascii="Aptos" w:hAnsi="Aptos"/>
+                <w:sz w:val="20"/>
+              </w:rPr>
               <w:br/>
             </w:r>
           </w:p>
@@ -1159,19 +1321,62 @@
         <w:ind w:left="2" w:hanging="4"/>
         <w:jc w:val="center"/>
         <w:rPr>
+          <w:rFonts w:ascii="Aptos" w:hAnsi="Aptos"/>
+          <w:b/>
+          <w:sz w:val="44"/>
+        </w:rPr>
+      </w:pPr>
+    </w:p>
+    <w:p>
+      <w:pPr>
+        <w:ind w:left="2" w:hanging="4"/>
+        <w:jc w:val="center"/>
+        <w:rPr>
+          <w:rFonts w:ascii="Aptos" w:hAnsi="Aptos"/>
+          <w:b/>
+          <w:sz w:val="44"/>
+        </w:rPr>
+      </w:pPr>
+    </w:p>
+    <w:p>
+      <w:pPr>
+        <w:ind w:left="2" w:hanging="4"/>
+        <w:jc w:val="center"/>
+        <w:rPr>
+          <w:rFonts w:ascii="Aptos" w:hAnsi="Aptos"/>
+          <w:b/>
+          <w:sz w:val="44"/>
+        </w:rPr>
+      </w:pPr>
+    </w:p>
+    <w:p>
+      <w:pPr>
+        <w:ind w:left="2" w:hanging="4"/>
+        <w:jc w:val="center"/>
+        <w:rPr>
           <w:rFonts w:ascii="Aptos" w:eastAsia="Cambria" w:hAnsi="Aptos" w:cs="Cambria"/>
           <w:b/>
           <w:sz w:val="44"/>
           <w:szCs w:val="44"/>
         </w:rPr>
       </w:pPr>
+      <w:proofErr w:type="spellStart"/>
       <w:r>
         <w:rPr>
           <w:rFonts w:ascii="Aptos" w:hAnsi="Aptos"/>
           <w:b/>
           <w:sz w:val="44"/>
         </w:rPr>
-        <w:t>MediGuide AI: A Multimodal Multi-Agent Healthcare Navigation System</w:t>
+        <w:t>MediGuide</w:t>
+      </w:r>
+      <w:proofErr w:type="spellEnd"/>
+      <w:r>
+        <w:rPr>
+          <w:rFonts w:ascii="Aptos" w:hAnsi="Aptos"/>
+          <w:b/>
+          <w:sz w:val="44"/>
+        </w:rPr>
+        <w:t xml:space="preserve"> AI: A Multimodal Multi-Agent Healthcare Navigation System</w:t>
       </w:r>
     </w:p>
     <w:p>
@@ -1218,11 +1423,9 @@
           <w:i/>
         </w:rPr>
       </w:pPr>
-      <w:r/>
       <w:r>
         <w:rPr>
           <w:rFonts w:ascii="Aptos" w:hAnsi="Aptos"/>
-          <w:sz w:val="24"/>
         </w:rPr>
         <w:t>Healthcare accessibility and medication safety represent two of the most critical challenges in contemporary global medicine. According to the World Health Organization and the Institute of Medicine, over 250,000 preventable deaths occur annually due to medical errors, predominantly arising from undetected drug-drug interactions, therapeutic duplications, misinterpreted laboratory diagnostics, and non-adherence to complex medication timing schedules. This systemic crisis is exacerbated in developing nations like India, where the physician-to-population ratio stands at a critical 1:1,457, leaving millions of patients without timely access to qualified clinical interpretations of their diagnostic reports. To address this gap, this project proposes MediGuide AI, an advanced, consumer-facing multimodal multi-agent healthcare navigation and clinical decision support system built on Google's Agent Development Kit (ADK) framework.</w:t>
       </w:r>
@@ -1235,106 +1438,49 @@
           <w:rFonts w:ascii="Aptos" w:eastAsia="Cambria" w:hAnsi="Aptos" w:cs="Cambria"/>
         </w:rPr>
       </w:pPr>
-      <w:r/>
       <w:r>
         <w:rPr>
           <w:rFonts w:ascii="Aptos" w:hAnsi="Aptos"/>
-          <w:sz w:val="24"/>
         </w:rPr>
         <w:t>MediGuide AI coordinates five specialized domain-specialist AI sub-agents — TriageAgent, ResearchAgent, SchedulerAgent, VisionAgent, and LabAgent — via a root OrchestratorAgent that routes patient queries with clinical precision. Unlike general-purpose large language models that generate probabilistic and potentially hallucinatory text, MediGuide AI implements a hybrid architecture combining large language model reasoning with a local, deterministic clinical database for safety-critical checks. The system's technical core comprises five primary modules: (1) a Multimodal Image Processing Pipeline utilizing Pillow image normalization, scaling, and contrast enhancement (CLAHE) coupled with Gemini Vision to perform handwritten prescription OCR, skin lesion classification, and ECG/X-ray triage; (2) an Intelligent Lab Report Analyzer that parses blood test values against age- and gender-adjusted clinical reference ranges, flagging CRITICAL, WARNING, and NORMAL values with clear, actionable explanations; (3) a Food-Drug and Lifestyle Interaction Safety Engine identifying clinical contraindications across 8 major food categories (e.g., Grapefruit juice and Warfarin which causes a 2-5x overdose risk); (4) a 7-factor weighted Health Risk Score algorithm producing a quantified 1-100 severity index; and (5) a Personalized Medication Schedule generator providing clinically optimal daily time-slot assignments.</w:t>
       </w:r>
     </w:p>
     <w:p>
       <w:pPr>
+        <w:ind w:left="0" w:hanging="2"/>
         <w:jc w:val="both"/>
       </w:pPr>
       <w:r>
         <w:rPr>
           <w:rFonts w:ascii="Aptos" w:hAnsi="Aptos"/>
-          <w:sz w:val="24"/>
-        </w:rPr>
-        <w:t>Evaluation using real-world clinical reports and prescription images shows that the system achieves high reliability in identifying drug-drug therapeutic duplications (such as flagging the concurrent use of the brand name Trimox and generic Amoxicillin), provides immediate life-saving alerts for critical diagnostic results (e.g., triggering emergency protocols for elevated cardiac Troponin or potassium levels), and correctly generates patient-friendly dietary and timing safety instructions. By bridging the critical gap between complex diagnostic output and patient understanding, MediGuide AI provides a scalable, secure, and deployable solution to reduce preventable medical errors and improve home-level patient safety.</w:t>
+        </w:rPr>
+        <w:t>Evaluation using real-world clinical reports and prescription images shows that the system achieves high reliability in identifying drug-drug therapeutic duplications (such as flagging the concurrent use of the brand name Trimox and generic Amoxicillin), provides immediate life-saving alerts for critical diagnostic results</w:t>
+      </w:r>
+      <w:r>
+        <w:rPr>
+          <w:rFonts w:ascii="Aptos" w:hAnsi="Aptos"/>
+        </w:rPr>
+        <w:t xml:space="preserve"> </w:t>
+      </w:r>
+      <w:proofErr w:type="gramStart"/>
+      <w:r>
+        <w:rPr>
+          <w:rFonts w:ascii="Aptos" w:hAnsi="Aptos"/>
+        </w:rPr>
+        <w:t>By</w:t>
+      </w:r>
+      <w:proofErr w:type="gramEnd"/>
+      <w:r>
+        <w:rPr>
+          <w:rFonts w:ascii="Aptos" w:hAnsi="Aptos"/>
+        </w:rPr>
+        <w:t xml:space="preserve"> bridging the critical gap between complex diagnostic output and patient understanding, </w:t>
       </w:r>
     </w:p>
     <w:p>
       <w:pPr>
         <w:ind w:left="0" w:hanging="2"/>
-        <w:rPr>
-          <w:rFonts w:ascii="Aptos" w:eastAsia="Cambria" w:hAnsi="Aptos" w:cs="Cambria"/>
-          <w:b/>
-        </w:rPr>
-      </w:pPr>
-    </w:p>
-    <w:p>
-      <w:pPr>
-        <w:ind w:left="0" w:hanging="2"/>
-        <w:rPr>
-          <w:rFonts w:ascii="Aptos" w:eastAsia="Cambria" w:hAnsi="Aptos" w:cs="Cambria"/>
-          <w:b/>
-        </w:rPr>
-      </w:pPr>
-    </w:p>
-    <w:p>
-      <w:pPr>
-        <w:ind w:left="0" w:hanging="2"/>
-        <w:rPr>
-          <w:rFonts w:ascii="Aptos" w:eastAsia="Cambria" w:hAnsi="Aptos" w:cs="Cambria"/>
-          <w:b/>
-        </w:rPr>
-      </w:pPr>
-    </w:p>
-    <w:p>
-      <w:pPr>
-        <w:ind w:left="0" w:hanging="2"/>
-        <w:rPr>
-          <w:rFonts w:ascii="Aptos" w:eastAsia="Cambria" w:hAnsi="Aptos" w:cs="Cambria"/>
-          <w:b/>
-        </w:rPr>
-      </w:pPr>
-    </w:p>
-    <w:p>
-      <w:pPr>
-        <w:ind w:left="0" w:hanging="2"/>
-        <w:rPr>
-          <w:rFonts w:ascii="Aptos" w:eastAsia="Cambria" w:hAnsi="Aptos" w:cs="Cambria"/>
-          <w:b/>
-        </w:rPr>
-      </w:pPr>
-    </w:p>
-    <w:p>
-      <w:pPr>
-        <w:ind w:left="0" w:hanging="2"/>
-        <w:rPr>
-          <w:rFonts w:ascii="Aptos" w:eastAsia="Cambria" w:hAnsi="Aptos" w:cs="Cambria"/>
-          <w:b/>
-        </w:rPr>
-      </w:pPr>
-    </w:p>
-    <w:p>
-      <w:pPr>
-        <w:ind w:left="0" w:hanging="2"/>
-        <w:rPr>
-          <w:rFonts w:ascii="Aptos" w:eastAsia="Cambria" w:hAnsi="Aptos" w:cs="Cambria"/>
-          <w:b/>
-        </w:rPr>
-      </w:pPr>
-    </w:p>
-    <w:p>
-      <w:pPr>
-        <w:ind w:left="0" w:hanging="2"/>
-        <w:rPr>
-          <w:rFonts w:ascii="Aptos" w:eastAsia="Cambria" w:hAnsi="Aptos" w:cs="Cambria"/>
-          <w:b/>
-        </w:rPr>
-      </w:pPr>
-    </w:p>
-    <w:p>
-      <w:pPr>
-        <w:ind w:left="0" w:hanging="2"/>
-        <w:rPr>
-          <w:rFonts w:ascii="Aptos" w:eastAsia="Cambria" w:hAnsi="Aptos" w:cs="Cambria"/>
-          <w:b/>
-        </w:rPr>
+        <w:jc w:val="both"/>
       </w:pPr>
     </w:p>
     <w:p>
@@ -1347,7 +1493,6 @@
           <w:sz w:val="22"/>
         </w:rPr>
       </w:pPr>
-      <w:r/>
       <w:r>
         <w:rPr>
           <w:rFonts w:ascii="Aptos" w:hAnsi="Aptos"/>
@@ -1365,194 +1510,6 @@
         </w:rPr>
         <w:t>Multi-Agent AI, Google ADK, Medication Safety, Lab Report Analysis, Multimodal Vision, Healthcare Triage, Clinical Decision Support</w:t>
       </w:r>
-    </w:p>
-    <w:p>
-      <w:pPr>
-        <w:ind w:left="0" w:hanging="2"/>
-        <w:rPr>
-          <w:rFonts w:ascii="Aptos" w:eastAsia="Cambria" w:hAnsi="Aptos" w:cs="Cambria"/>
-          <w:b/>
-        </w:rPr>
-      </w:pPr>
-    </w:p>
-    <w:p>
-      <w:pPr>
-        <w:ind w:left="0" w:hanging="2"/>
-        <w:rPr>
-          <w:rFonts w:ascii="Aptos" w:eastAsia="Cambria" w:hAnsi="Aptos" w:cs="Cambria"/>
-          <w:b/>
-        </w:rPr>
-      </w:pPr>
-    </w:p>
-    <w:p>
-      <w:pPr>
-        <w:ind w:left="0" w:hanging="2"/>
-        <w:rPr>
-          <w:rFonts w:ascii="Aptos" w:eastAsia="Cambria" w:hAnsi="Aptos" w:cs="Cambria"/>
-          <w:b/>
-        </w:rPr>
-      </w:pPr>
-    </w:p>
-    <w:p>
-      <w:pPr>
-        <w:ind w:left="0" w:hanging="2"/>
-        <w:rPr>
-          <w:rFonts w:ascii="Aptos" w:eastAsia="Cambria" w:hAnsi="Aptos" w:cs="Cambria"/>
-          <w:b/>
-        </w:rPr>
-      </w:pPr>
-    </w:p>
-    <w:p>
-      <w:pPr>
-        <w:ind w:left="0" w:hanging="2"/>
-        <w:rPr>
-          <w:rFonts w:ascii="Aptos" w:eastAsia="Cambria" w:hAnsi="Aptos" w:cs="Cambria"/>
-          <w:b/>
-        </w:rPr>
-      </w:pPr>
-    </w:p>
-    <w:p>
-      <w:pPr>
-        <w:ind w:left="0" w:hanging="2"/>
-        <w:rPr>
-          <w:rFonts w:ascii="Aptos" w:eastAsia="Cambria" w:hAnsi="Aptos" w:cs="Cambria"/>
-          <w:b/>
-        </w:rPr>
-      </w:pPr>
-    </w:p>
-    <w:p>
-      <w:pPr>
-        <w:ind w:left="0" w:hanging="2"/>
-        <w:rPr>
-          <w:rFonts w:ascii="Aptos" w:eastAsia="Cambria" w:hAnsi="Aptos" w:cs="Cambria"/>
-          <w:b/>
-        </w:rPr>
-      </w:pPr>
-    </w:p>
-    <w:p>
-      <w:pPr>
-        <w:ind w:left="0" w:hanging="2"/>
-        <w:rPr>
-          <w:rFonts w:ascii="Aptos" w:eastAsia="Cambria" w:hAnsi="Aptos" w:cs="Cambria"/>
-          <w:b/>
-        </w:rPr>
-      </w:pPr>
-    </w:p>
-    <w:p>
-      <w:pPr>
-        <w:ind w:left="0" w:hanging="2"/>
-        <w:rPr>
-          <w:rFonts w:ascii="Aptos" w:eastAsia="Cambria" w:hAnsi="Aptos" w:cs="Cambria"/>
-          <w:b/>
-        </w:rPr>
-      </w:pPr>
-    </w:p>
-    <w:p>
-      <w:pPr>
-        <w:ind w:left="0" w:hanging="2"/>
-        <w:rPr>
-          <w:rFonts w:ascii="Aptos" w:eastAsia="Cambria" w:hAnsi="Aptos" w:cs="Cambria"/>
-          <w:b/>
-        </w:rPr>
-      </w:pPr>
-    </w:p>
-    <w:p>
-      <w:pPr>
-        <w:ind w:left="0" w:hanging="2"/>
-        <w:rPr>
-          <w:rFonts w:ascii="Aptos" w:eastAsia="Cambria" w:hAnsi="Aptos" w:cs="Cambria"/>
-          <w:b/>
-        </w:rPr>
-      </w:pPr>
-    </w:p>
-    <w:p>
-      <w:pPr>
-        <w:ind w:left="0" w:hanging="2"/>
-        <w:rPr>
-          <w:rFonts w:ascii="Aptos" w:eastAsia="Cambria" w:hAnsi="Aptos" w:cs="Cambria"/>
-          <w:b/>
-        </w:rPr>
-      </w:pPr>
-    </w:p>
-    <w:p>
-      <w:pPr>
-        <w:ind w:left="0" w:hanging="2"/>
-        <w:rPr>
-          <w:rFonts w:ascii="Aptos" w:eastAsia="Cambria" w:hAnsi="Aptos" w:cs="Cambria"/>
-          <w:b/>
-        </w:rPr>
-      </w:pPr>
-    </w:p>
-    <w:p>
-      <w:pPr>
-        <w:ind w:left="0" w:hanging="2"/>
-        <w:rPr>
-          <w:rFonts w:ascii="Aptos" w:eastAsia="Cambria" w:hAnsi="Aptos" w:cs="Cambria"/>
-          <w:b/>
-        </w:rPr>
-      </w:pPr>
-    </w:p>
-    <w:p>
-      <w:pPr>
-        <w:ind w:leftChars="0" w:left="0" w:firstLineChars="0" w:firstLine="0"/>
-        <w:rPr>
-          <w:rFonts w:ascii="Aptos" w:eastAsia="Cambria" w:hAnsi="Aptos" w:cs="Cambria"/>
-          <w:b/>
-        </w:rPr>
-      </w:pPr>
-    </w:p>
-    <w:p>
-      <w:pPr>
-        <w:pBdr>
-          <w:top w:val="nil"/>
-          <w:left w:val="nil"/>
-          <w:bottom w:val="nil"/>
-          <w:right w:val="nil"/>
-          <w:between w:val="nil"/>
-        </w:pBdr>
-        <w:spacing w:line="240" w:lineRule="auto"/>
-        <w:ind w:leftChars="0" w:left="0" w:firstLineChars="0" w:firstLine="0"/>
-        <w:rPr>
-          <w:rFonts w:ascii="Aptos" w:eastAsia="Cambria" w:hAnsi="Aptos" w:cs="Cambria"/>
-          <w:color w:val="000000"/>
-        </w:rPr>
-      </w:pPr>
-      <w:bookmarkStart w:id="0" w:name="_GoBack"/>
-      <w:bookmarkEnd w:id="0"/>
-    </w:p>
-    <w:p>
-      <w:pPr>
-        <w:pBdr>
-          <w:top w:val="nil"/>
-          <w:left w:val="nil"/>
-          <w:bottom w:val="nil"/>
-          <w:right w:val="nil"/>
-          <w:between w:val="nil"/>
-        </w:pBdr>
-        <w:spacing w:line="240" w:lineRule="auto"/>
-        <w:ind w:leftChars="0" w:left="0" w:firstLineChars="0" w:firstLine="0"/>
-        <w:rPr>
-          <w:rFonts w:ascii="Aptos" w:eastAsia="Cambria" w:hAnsi="Aptos" w:cs="Cambria"/>
-          <w:color w:val="000000"/>
-        </w:rPr>
-      </w:pPr>
-    </w:p>
-    <w:p>
-      <w:pPr>
-        <w:pBdr>
-          <w:top w:val="nil"/>
-          <w:left w:val="nil"/>
-          <w:bottom w:val="nil"/>
-          <w:right w:val="nil"/>
-          <w:between w:val="nil"/>
-        </w:pBdr>
-        <w:spacing w:line="240" w:lineRule="auto"/>
-        <w:ind w:leftChars="0" w:left="0" w:firstLineChars="0" w:firstLine="0"/>
-        <w:rPr>
-          <w:rFonts w:ascii="Aptos" w:eastAsia="Cambria" w:hAnsi="Aptos" w:cs="Cambria"/>
-          <w:color w:val="000000"/>
-        </w:rPr>
-      </w:pPr>
     </w:p>
     <w:p>
       <w:pPr>
@@ -1865,6 +1822,7 @@
           <w:bCs/>
           <w:color w:val="000000"/>
         </w:rPr>
+        <w:lastRenderedPageBreak/>
         <w:tab/>
       </w:r>
       <w:r>
@@ -1912,7 +1870,7 @@
 </file>
 
 <file path=word/endnotes.xml><?xml version="1.0" encoding="utf-8"?>
-<w:endnotes xmlns:wpc="http://schemas.microsoft.com/office/word/2010/wordprocessingCanvas" xmlns:cx="http://schemas.microsoft.com/office/drawing/2014/chartex" xmlns:cx1="http://schemas.microsoft.com/office/drawing/2015/9/8/chartex" xmlns:mc="http://schemas.openxmlformats.org/markup-compatibility/2006" xmlns:o="urn:schemas-microsoft-com:office:office" xmlns:r="http://schemas.openxmlformats.org/officeDocument/2006/relationships" xmlns:m="http://schemas.openxmlformats.org/officeDocument/2006/math" xmlns:v="urn:schemas-microsoft-com:vml" xmlns:wp14="http://schemas.microsoft.com/office/word/2010/wordprocessingDrawing" xmlns:wp="http://schemas.openxmlformats.org/drawingml/2006/wordprocessingDrawing" xmlns:w10="urn:schemas-microsoft-com:office:word" xmlns:w="http://schemas.openxmlformats.org/wordprocessingml/2006/main" xmlns:w14="http://schemas.microsoft.com/office/word/2010/wordml" xmlns:w15="http://schemas.microsoft.com/office/word/2012/wordml" xmlns:w16se="http://schemas.microsoft.com/office/word/2015/wordml/symex" xmlns:wpg="http://schemas.microsoft.com/office/word/2010/wordprocessingGroup" xmlns:wpi="http://schemas.microsoft.com/office/word/2010/wordprocessingInk" xmlns:wne="http://schemas.microsoft.com/office/word/2006/wordml" xmlns:wps="http://schemas.microsoft.com/office/word/2010/wordprocessingShape" mc:Ignorable="w14 w15 w16se wp14">
+<w:endnotes xmlns:wpc="http://schemas.microsoft.com/office/word/2010/wordprocessingCanvas" xmlns:cx="http://schemas.microsoft.com/office/drawing/2014/chartex" xmlns:cx1="http://schemas.microsoft.com/office/drawing/2015/9/8/chartex" xmlns:cx2="http://schemas.microsoft.com/office/drawing/2015/10/21/chartex" xmlns:cx3="http://schemas.microsoft.com/office/drawing/2016/5/9/chartex" xmlns:cx4="http://schemas.microsoft.com/office/drawing/2016/5/10/chartex" xmlns:cx5="http://schemas.microsoft.com/office/drawing/2016/5/11/chartex" xmlns:cx6="http://schemas.microsoft.com/office/drawing/2016/5/12/chartex" xmlns:cx7="http://schemas.microsoft.com/office/drawing/2016/5/13/chartex" xmlns:cx8="http://schemas.microsoft.com/office/drawing/2016/5/14/chartex" xmlns:mc="http://schemas.openxmlformats.org/markup-compatibility/2006" xmlns:aink="http://schemas.microsoft.com/office/drawing/2016/ink" xmlns:am3d="http://schemas.microsoft.com/office/drawing/2017/model3d" xmlns:o="urn:schemas-microsoft-com:office:office" xmlns:oel="http://schemas.microsoft.com/office/2019/extlst" xmlns:r="http://schemas.openxmlformats.org/officeDocument/2006/relationships" xmlns:m="http://schemas.openxmlformats.org/officeDocument/2006/math" xmlns:v="urn:schemas-microsoft-com:vml" xmlns:wp14="http://schemas.microsoft.com/office/word/2010/wordprocessingDrawing" xmlns:wp="http://schemas.openxmlformats.org/drawingml/2006/wordprocessingDrawing" xmlns:w10="urn:schemas-microsoft-com:office:word" xmlns:w="http://schemas.openxmlformats.org/wordprocessingml/2006/main" xmlns:w14="http://schemas.microsoft.com/office/word/2010/wordml" xmlns:w15="http://schemas.microsoft.com/office/word/2012/wordml" xmlns:w16cex="http://schemas.microsoft.com/office/word/2018/wordml/cex" xmlns:w16cid="http://schemas.microsoft.com/office/word/2016/wordml/cid" xmlns:w16="http://schemas.microsoft.com/office/word/2018/wordml" xmlns:w16du="http://schemas.microsoft.com/office/word/2023/wordml/word16du" xmlns:w16sdtdh="http://schemas.microsoft.com/office/word/2020/wordml/sdtdatahash" xmlns:w16sdtfl="http://schemas.microsoft.com/office/word/2024/wordml/sdtformatlock" xmlns:w16se="http://schemas.microsoft.com/office/word/2015/wordml/symex" xmlns:wpg="http://schemas.microsoft.com/office/word/2010/wordprocessingGroup" xmlns:wpi="http://schemas.microsoft.com/office/word/2010/wordprocessingInk" xmlns:wne="http://schemas.microsoft.com/office/word/2006/wordml" xmlns:wps="http://schemas.microsoft.com/office/word/2010/wordprocessingShape" mc:Ignorable="w14 w15 w16se w16cid w16 w16cex w16sdtdh w16sdtfl w16du wp14">
   <w:endnote w:type="separator" w:id="-1">
     <w:p>
       <w:pPr>
@@ -1939,7 +1897,7 @@
 </file>
 
 <file path=word/footer1.xml><?xml version="1.0" encoding="utf-8"?>
-<w:ftr xmlns:wpc="http://schemas.microsoft.com/office/word/2010/wordprocessingCanvas" xmlns:cx="http://schemas.microsoft.com/office/drawing/2014/chartex" xmlns:cx1="http://schemas.microsoft.com/office/drawing/2015/9/8/chartex" xmlns:mc="http://schemas.openxmlformats.org/markup-compatibility/2006" xmlns:o="urn:schemas-microsoft-com:office:office" xmlns:r="http://schemas.openxmlformats.org/officeDocument/2006/relationships" xmlns:m="http://schemas.openxmlformats.org/officeDocument/2006/math" xmlns:v="urn:schemas-microsoft-com:vml" xmlns:wp14="http://schemas.microsoft.com/office/word/2010/wordprocessingDrawing" xmlns:wp="http://schemas.openxmlformats.org/drawingml/2006/wordprocessingDrawing" xmlns:w10="urn:schemas-microsoft-com:office:word" xmlns:w="http://schemas.openxmlformats.org/wordprocessingml/2006/main" xmlns:w14="http://schemas.microsoft.com/office/word/2010/wordml" xmlns:w15="http://schemas.microsoft.com/office/word/2012/wordml" xmlns:w16se="http://schemas.microsoft.com/office/word/2015/wordml/symex" xmlns:wpg="http://schemas.microsoft.com/office/word/2010/wordprocessingGroup" xmlns:wpi="http://schemas.microsoft.com/office/word/2010/wordprocessingInk" xmlns:wne="http://schemas.microsoft.com/office/word/2006/wordml" xmlns:wps="http://schemas.microsoft.com/office/word/2010/wordprocessingShape" mc:Ignorable="w14 w15 w16se wp14">
+<w:ftr xmlns:wpc="http://schemas.microsoft.com/office/word/2010/wordprocessingCanvas" xmlns:cx="http://schemas.microsoft.com/office/drawing/2014/chartex" xmlns:cx1="http://schemas.microsoft.com/office/drawing/2015/9/8/chartex" xmlns:cx2="http://schemas.microsoft.com/office/drawing/2015/10/21/chartex" xmlns:cx3="http://schemas.microsoft.com/office/drawing/2016/5/9/chartex" xmlns:cx4="http://schemas.microsoft.com/office/drawing/2016/5/10/chartex" xmlns:cx5="http://schemas.microsoft.com/office/drawing/2016/5/11/chartex" xmlns:cx6="http://schemas.microsoft.com/office/drawing/2016/5/12/chartex" xmlns:cx7="http://schemas.microsoft.com/office/drawing/2016/5/13/chartex" xmlns:cx8="http://schemas.microsoft.com/office/drawing/2016/5/14/chartex" xmlns:mc="http://schemas.openxmlformats.org/markup-compatibility/2006" xmlns:aink="http://schemas.microsoft.com/office/drawing/2016/ink" xmlns:am3d="http://schemas.microsoft.com/office/drawing/2017/model3d" xmlns:o="urn:schemas-microsoft-com:office:office" xmlns:oel="http://schemas.microsoft.com/office/2019/extlst" xmlns:r="http://schemas.openxmlformats.org/officeDocument/2006/relationships" xmlns:m="http://schemas.openxmlformats.org/officeDocument/2006/math" xmlns:v="urn:schemas-microsoft-com:vml" xmlns:wp14="http://schemas.microsoft.com/office/word/2010/wordprocessingDrawing" xmlns:wp="http://schemas.openxmlformats.org/drawingml/2006/wordprocessingDrawing" xmlns:w10="urn:schemas-microsoft-com:office:word" xmlns:w="http://schemas.openxmlformats.org/wordprocessingml/2006/main" xmlns:w14="http://schemas.microsoft.com/office/word/2010/wordml" xmlns:w15="http://schemas.microsoft.com/office/word/2012/wordml" xmlns:w16cex="http://schemas.microsoft.com/office/word/2018/wordml/cex" xmlns:w16cid="http://schemas.microsoft.com/office/word/2016/wordml/cid" xmlns:w16="http://schemas.microsoft.com/office/word/2018/wordml" xmlns:w16du="http://schemas.microsoft.com/office/word/2023/wordml/word16du" xmlns:w16sdtdh="http://schemas.microsoft.com/office/word/2020/wordml/sdtdatahash" xmlns:w16sdtfl="http://schemas.microsoft.com/office/word/2024/wordml/sdtformatlock" xmlns:w16se="http://schemas.microsoft.com/office/word/2015/wordml/symex" xmlns:wpg="http://schemas.microsoft.com/office/word/2010/wordprocessingGroup" xmlns:wpi="http://schemas.microsoft.com/office/word/2010/wordprocessingInk" xmlns:wne="http://schemas.microsoft.com/office/word/2006/wordml" xmlns:wps="http://schemas.microsoft.com/office/word/2010/wordprocessingShape" mc:Ignorable="w14 w15 w16se w16cid w16 w16cex w16sdtdh w16sdtfl w16du wp14">
   <w:p>
     <w:pPr>
       <w:pStyle w:val="Footer"/>
@@ -1950,7 +1908,7 @@
 </file>
 
 <file path=word/footer2.xml><?xml version="1.0" encoding="utf-8"?>
-<w:ftr xmlns:wpc="http://schemas.microsoft.com/office/word/2010/wordprocessingCanvas" xmlns:cx="http://schemas.microsoft.com/office/drawing/2014/chartex" xmlns:cx1="http://schemas.microsoft.com/office/drawing/2015/9/8/chartex" xmlns:mc="http://schemas.openxmlformats.org/markup-compatibility/2006" xmlns:o="urn:schemas-microsoft-com:office:office" xmlns:r="http://schemas.openxmlformats.org/officeDocument/2006/relationships" xmlns:m="http://schemas.openxmlformats.org/officeDocument/2006/math" xmlns:v="urn:schemas-microsoft-com:vml" xmlns:wp14="http://schemas.microsoft.com/office/word/2010/wordprocessingDrawing" xmlns:wp="http://schemas.openxmlformats.org/drawingml/2006/wordprocessingDrawing" xmlns:w10="urn:schemas-microsoft-com:office:word" xmlns:w="http://schemas.openxmlformats.org/wordprocessingml/2006/main" xmlns:w14="http://schemas.microsoft.com/office/word/2010/wordml" xmlns:w15="http://schemas.microsoft.com/office/word/2012/wordml" xmlns:w16se="http://schemas.microsoft.com/office/word/2015/wordml/symex" xmlns:wpg="http://schemas.microsoft.com/office/word/2010/wordprocessingGroup" xmlns:wpi="http://schemas.microsoft.com/office/word/2010/wordprocessingInk" xmlns:wne="http://schemas.microsoft.com/office/word/2006/wordml" xmlns:wps="http://schemas.microsoft.com/office/word/2010/wordprocessingShape" mc:Ignorable="w14 w15 w16se wp14">
+<w:ftr xmlns:wpc="http://schemas.microsoft.com/office/word/2010/wordprocessingCanvas" xmlns:cx="http://schemas.microsoft.com/office/drawing/2014/chartex" xmlns:cx1="http://schemas.microsoft.com/office/drawing/2015/9/8/chartex" xmlns:cx2="http://schemas.microsoft.com/office/drawing/2015/10/21/chartex" xmlns:cx3="http://schemas.microsoft.com/office/drawing/2016/5/9/chartex" xmlns:cx4="http://schemas.microsoft.com/office/drawing/2016/5/10/chartex" xmlns:cx5="http://schemas.microsoft.com/office/drawing/2016/5/11/chartex" xmlns:cx6="http://schemas.microsoft.com/office/drawing/2016/5/12/chartex" xmlns:cx7="http://schemas.microsoft.com/office/drawing/2016/5/13/chartex" xmlns:cx8="http://schemas.microsoft.com/office/drawing/2016/5/14/chartex" xmlns:mc="http://schemas.openxmlformats.org/markup-compatibility/2006" xmlns:aink="http://schemas.microsoft.com/office/drawing/2016/ink" xmlns:am3d="http://schemas.microsoft.com/office/drawing/2017/model3d" xmlns:o="urn:schemas-microsoft-com:office:office" xmlns:oel="http://schemas.microsoft.com/office/2019/extlst" xmlns:r="http://schemas.openxmlformats.org/officeDocument/2006/relationships" xmlns:m="http://schemas.openxmlformats.org/officeDocument/2006/math" xmlns:v="urn:schemas-microsoft-com:vml" xmlns:wp14="http://schemas.microsoft.com/office/word/2010/wordprocessingDrawing" xmlns:wp="http://schemas.openxmlformats.org/drawingml/2006/wordprocessingDrawing" xmlns:w10="urn:schemas-microsoft-com:office:word" xmlns:w="http://schemas.openxmlformats.org/wordprocessingml/2006/main" xmlns:w14="http://schemas.microsoft.com/office/word/2010/wordml" xmlns:w15="http://schemas.microsoft.com/office/word/2012/wordml" xmlns:w16cex="http://schemas.microsoft.com/office/word/2018/wordml/cex" xmlns:w16cid="http://schemas.microsoft.com/office/word/2016/wordml/cid" xmlns:w16="http://schemas.microsoft.com/office/word/2018/wordml" xmlns:w16du="http://schemas.microsoft.com/office/word/2023/wordml/word16du" xmlns:w16sdtdh="http://schemas.microsoft.com/office/word/2020/wordml/sdtdatahash" xmlns:w16sdtfl="http://schemas.microsoft.com/office/word/2024/wordml/sdtformatlock" xmlns:w16se="http://schemas.microsoft.com/office/word/2015/wordml/symex" xmlns:wpg="http://schemas.microsoft.com/office/word/2010/wordprocessingGroup" xmlns:wpi="http://schemas.microsoft.com/office/word/2010/wordprocessingInk" xmlns:wne="http://schemas.microsoft.com/office/word/2006/wordml" xmlns:wps="http://schemas.microsoft.com/office/word/2010/wordprocessingShape" mc:Ignorable="w14 w15 w16se w16cid w16 w16cex w16sdtdh w16sdtfl w16du wp14">
   <w:p>
     <w:pPr>
       <w:pStyle w:val="Footer"/>
@@ -2058,7 +2016,7 @@
 </file>
 
 <file path=word/footer3.xml><?xml version="1.0" encoding="utf-8"?>
-<w:ftr xmlns:wpc="http://schemas.microsoft.com/office/word/2010/wordprocessingCanvas" xmlns:cx="http://schemas.microsoft.com/office/drawing/2014/chartex" xmlns:cx1="http://schemas.microsoft.com/office/drawing/2015/9/8/chartex" xmlns:mc="http://schemas.openxmlformats.org/markup-compatibility/2006" xmlns:o="urn:schemas-microsoft-com:office:office" xmlns:r="http://schemas.openxmlformats.org/officeDocument/2006/relationships" xmlns:m="http://schemas.openxmlformats.org/officeDocument/2006/math" xmlns:v="urn:schemas-microsoft-com:vml" xmlns:wp14="http://schemas.microsoft.com/office/word/2010/wordprocessingDrawing" xmlns:wp="http://schemas.openxmlformats.org/drawingml/2006/wordprocessingDrawing" xmlns:w10="urn:schemas-microsoft-com:office:word" xmlns:w="http://schemas.openxmlformats.org/wordprocessingml/2006/main" xmlns:w14="http://schemas.microsoft.com/office/word/2010/wordml" xmlns:w15="http://schemas.microsoft.com/office/word/2012/wordml" xmlns:w16se="http://schemas.microsoft.com/office/word/2015/wordml/symex" xmlns:wpg="http://schemas.microsoft.com/office/word/2010/wordprocessingGroup" xmlns:wpi="http://schemas.microsoft.com/office/word/2010/wordprocessingInk" xmlns:wne="http://schemas.microsoft.com/office/word/2006/wordml" xmlns:wps="http://schemas.microsoft.com/office/word/2010/wordprocessingShape" mc:Ignorable="w14 w15 w16se wp14">
+<w:ftr xmlns:wpc="http://schemas.microsoft.com/office/word/2010/wordprocessingCanvas" xmlns:cx="http://schemas.microsoft.com/office/drawing/2014/chartex" xmlns:cx1="http://schemas.microsoft.com/office/drawing/2015/9/8/chartex" xmlns:cx2="http://schemas.microsoft.com/office/drawing/2015/10/21/chartex" xmlns:cx3="http://schemas.microsoft.com/office/drawing/2016/5/9/chartex" xmlns:cx4="http://schemas.microsoft.com/office/drawing/2016/5/10/chartex" xmlns:cx5="http://schemas.microsoft.com/office/drawing/2016/5/11/chartex" xmlns:cx6="http://schemas.microsoft.com/office/drawing/2016/5/12/chartex" xmlns:cx7="http://schemas.microsoft.com/office/drawing/2016/5/13/chartex" xmlns:cx8="http://schemas.microsoft.com/office/drawing/2016/5/14/chartex" xmlns:mc="http://schemas.openxmlformats.org/markup-compatibility/2006" xmlns:aink="http://schemas.microsoft.com/office/drawing/2016/ink" xmlns:am3d="http://schemas.microsoft.com/office/drawing/2017/model3d" xmlns:o="urn:schemas-microsoft-com:office:office" xmlns:oel="http://schemas.microsoft.com/office/2019/extlst" xmlns:r="http://schemas.openxmlformats.org/officeDocument/2006/relationships" xmlns:m="http://schemas.openxmlformats.org/officeDocument/2006/math" xmlns:v="urn:schemas-microsoft-com:vml" xmlns:wp14="http://schemas.microsoft.com/office/word/2010/wordprocessingDrawing" xmlns:wp="http://schemas.openxmlformats.org/drawingml/2006/wordprocessingDrawing" xmlns:w10="urn:schemas-microsoft-com:office:word" xmlns:w="http://schemas.openxmlformats.org/wordprocessingml/2006/main" xmlns:w14="http://schemas.microsoft.com/office/word/2010/wordml" xmlns:w15="http://schemas.microsoft.com/office/word/2012/wordml" xmlns:w16cex="http://schemas.microsoft.com/office/word/2018/wordml/cex" xmlns:w16cid="http://schemas.microsoft.com/office/word/2016/wordml/cid" xmlns:w16="http://schemas.microsoft.com/office/word/2018/wordml" xmlns:w16du="http://schemas.microsoft.com/office/word/2023/wordml/word16du" xmlns:w16sdtdh="http://schemas.microsoft.com/office/word/2020/wordml/sdtdatahash" xmlns:w16sdtfl="http://schemas.microsoft.com/office/word/2024/wordml/sdtformatlock" xmlns:w16se="http://schemas.microsoft.com/office/word/2015/wordml/symex" xmlns:wpg="http://schemas.microsoft.com/office/word/2010/wordprocessingGroup" xmlns:wpi="http://schemas.microsoft.com/office/word/2010/wordprocessingInk" xmlns:wne="http://schemas.microsoft.com/office/word/2006/wordml" xmlns:wps="http://schemas.microsoft.com/office/word/2010/wordprocessingShape" mc:Ignorable="w14 w15 w16se w16cid w16 w16cex w16sdtdh w16sdtfl w16du wp14">
   <w:p>
     <w:pPr>
       <w:pStyle w:val="Footer"/>
@@ -2069,7 +2027,7 @@
 </file>
 
 <file path=word/footnotes.xml><?xml version="1.0" encoding="utf-8"?>
-<w:footnotes xmlns:wpc="http://schemas.microsoft.com/office/word/2010/wordprocessingCanvas" xmlns:cx="http://schemas.microsoft.com/office/drawing/2014/chartex" xmlns:cx1="http://schemas.microsoft.com/office/drawing/2015/9/8/chartex" xmlns:mc="http://schemas.openxmlformats.org/markup-compatibility/2006" xmlns:o="urn:schemas-microsoft-com:office:office" xmlns:r="http://schemas.openxmlformats.org/officeDocument/2006/relationships" xmlns:m="http://schemas.openxmlformats.org/officeDocument/2006/math" xmlns:v="urn:schemas-microsoft-com:vml" xmlns:wp14="http://schemas.microsoft.com/office/word/2010/wordprocessingDrawing" xmlns:wp="http://schemas.openxmlformats.org/drawingml/2006/wordprocessingDrawing" xmlns:w10="urn:schemas-microsoft-com:office:word" xmlns:w="http://schemas.openxmlformats.org/wordprocessingml/2006/main" xmlns:w14="http://schemas.microsoft.com/office/word/2010/wordml" xmlns:w15="http://schemas.microsoft.com/office/word/2012/wordml" xmlns:w16se="http://schemas.microsoft.com/office/word/2015/wordml/symex" xmlns:wpg="http://schemas.microsoft.com/office/word/2010/wordprocessingGroup" xmlns:wpi="http://schemas.microsoft.com/office/word/2010/wordprocessingInk" xmlns:wne="http://schemas.microsoft.com/office/word/2006/wordml" xmlns:wps="http://schemas.microsoft.com/office/word/2010/wordprocessingShape" mc:Ignorable="w14 w15 w16se wp14">
+<w:footnotes xmlns:wpc="http://schemas.microsoft.com/office/word/2010/wordprocessingCanvas" xmlns:cx="http://schemas.microsoft.com/office/drawing/2014/chartex" xmlns:cx1="http://schemas.microsoft.com/office/drawing/2015/9/8/chartex" xmlns:cx2="http://schemas.microsoft.com/office/drawing/2015/10/21/chartex" xmlns:cx3="http://schemas.microsoft.com/office/drawing/2016/5/9/chartex" xmlns:cx4="http://schemas.microsoft.com/office/drawing/2016/5/10/chartex" xmlns:cx5="http://schemas.microsoft.com/office/drawing/2016/5/11/chartex" xmlns:cx6="http://schemas.microsoft.com/office/drawing/2016/5/12/chartex" xmlns:cx7="http://schemas.microsoft.com/office/drawing/2016/5/13/chartex" xmlns:cx8="http://schemas.microsoft.com/office/drawing/2016/5/14/chartex" xmlns:mc="http://schemas.openxmlformats.org/markup-compatibility/2006" xmlns:aink="http://schemas.microsoft.com/office/drawing/2016/ink" xmlns:am3d="http://schemas.microsoft.com/office/drawing/2017/model3d" xmlns:o="urn:schemas-microsoft-com:office:office" xmlns:oel="http://schemas.microsoft.com/office/2019/extlst" xmlns:r="http://schemas.openxmlformats.org/officeDocument/2006/relationships" xmlns:m="http://schemas.openxmlformats.org/officeDocument/2006/math" xmlns:v="urn:schemas-microsoft-com:vml" xmlns:wp14="http://schemas.microsoft.com/office/word/2010/wordprocessingDrawing" xmlns:wp="http://schemas.openxmlformats.org/drawingml/2006/wordprocessingDrawing" xmlns:w10="urn:schemas-microsoft-com:office:word" xmlns:w="http://schemas.openxmlformats.org/wordprocessingml/2006/main" xmlns:w14="http://schemas.microsoft.com/office/word/2010/wordml" xmlns:w15="http://schemas.microsoft.com/office/word/2012/wordml" xmlns:w16cex="http://schemas.microsoft.com/office/word/2018/wordml/cex" xmlns:w16cid="http://schemas.microsoft.com/office/word/2016/wordml/cid" xmlns:w16="http://schemas.microsoft.com/office/word/2018/wordml" xmlns:w16du="http://schemas.microsoft.com/office/word/2023/wordml/word16du" xmlns:w16sdtdh="http://schemas.microsoft.com/office/word/2020/wordml/sdtdatahash" xmlns:w16sdtfl="http://schemas.microsoft.com/office/word/2024/wordml/sdtformatlock" xmlns:w16se="http://schemas.microsoft.com/office/word/2015/wordml/symex" xmlns:wpg="http://schemas.microsoft.com/office/word/2010/wordprocessingGroup" xmlns:wpi="http://schemas.microsoft.com/office/word/2010/wordprocessingInk" xmlns:wne="http://schemas.microsoft.com/office/word/2006/wordml" xmlns:wps="http://schemas.microsoft.com/office/word/2010/wordprocessingShape" mc:Ignorable="w14 w15 w16se w16cid w16 w16cex w16sdtdh w16sdtfl w16du wp14">
   <w:footnote w:type="separator" w:id="-1">
     <w:p>
       <w:pPr>
@@ -2096,7 +2054,7 @@
 </file>
 
 <file path=word/header1.xml><?xml version="1.0" encoding="utf-8"?>
-<w:hdr xmlns:wpc="http://schemas.microsoft.com/office/word/2010/wordprocessingCanvas" xmlns:cx="http://schemas.microsoft.com/office/drawing/2014/chartex" xmlns:cx1="http://schemas.microsoft.com/office/drawing/2015/9/8/chartex" xmlns:mc="http://schemas.openxmlformats.org/markup-compatibility/2006" xmlns:o="urn:schemas-microsoft-com:office:office" xmlns:r="http://schemas.openxmlformats.org/officeDocument/2006/relationships" xmlns:m="http://schemas.openxmlformats.org/officeDocument/2006/math" xmlns:v="urn:schemas-microsoft-com:vml" xmlns:wp14="http://schemas.microsoft.com/office/word/2010/wordprocessingDrawing" xmlns:wp="http://schemas.openxmlformats.org/drawingml/2006/wordprocessingDrawing" xmlns:w10="urn:schemas-microsoft-com:office:word" xmlns:w="http://schemas.openxmlformats.org/wordprocessingml/2006/main" xmlns:w14="http://schemas.microsoft.com/office/word/2010/wordml" xmlns:w15="http://schemas.microsoft.com/office/word/2012/wordml" xmlns:w16se="http://schemas.microsoft.com/office/word/2015/wordml/symex" xmlns:wpg="http://schemas.microsoft.com/office/word/2010/wordprocessingGroup" xmlns:wpi="http://schemas.microsoft.com/office/word/2010/wordprocessingInk" xmlns:wne="http://schemas.microsoft.com/office/word/2006/wordml" xmlns:wps="http://schemas.microsoft.com/office/word/2010/wordprocessingShape" mc:Ignorable="w14 w15 w16se wp14">
+<w:hdr xmlns:wpc="http://schemas.microsoft.com/office/word/2010/wordprocessingCanvas" xmlns:cx="http://schemas.microsoft.com/office/drawing/2014/chartex" xmlns:cx1="http://schemas.microsoft.com/office/drawing/2015/9/8/chartex" xmlns:cx2="http://schemas.microsoft.com/office/drawing/2015/10/21/chartex" xmlns:cx3="http://schemas.microsoft.com/office/drawing/2016/5/9/chartex" xmlns:cx4="http://schemas.microsoft.com/office/drawing/2016/5/10/chartex" xmlns:cx5="http://schemas.microsoft.com/office/drawing/2016/5/11/chartex" xmlns:cx6="http://schemas.microsoft.com/office/drawing/2016/5/12/chartex" xmlns:cx7="http://schemas.microsoft.com/office/drawing/2016/5/13/chartex" xmlns:cx8="http://schemas.microsoft.com/office/drawing/2016/5/14/chartex" xmlns:mc="http://schemas.openxmlformats.org/markup-compatibility/2006" xmlns:aink="http://schemas.microsoft.com/office/drawing/2016/ink" xmlns:am3d="http://schemas.microsoft.com/office/drawing/2017/model3d" xmlns:o="urn:schemas-microsoft-com:office:office" xmlns:oel="http://schemas.microsoft.com/office/2019/extlst" xmlns:r="http://schemas.openxmlformats.org/officeDocument/2006/relationships" xmlns:m="http://schemas.openxmlformats.org/officeDocument/2006/math" xmlns:v="urn:schemas-microsoft-com:vml" xmlns:wp14="http://schemas.microsoft.com/office/word/2010/wordprocessingDrawing" xmlns:wp="http://schemas.openxmlformats.org/drawingml/2006/wordprocessingDrawing" xmlns:w10="urn:schemas-microsoft-com:office:word" xmlns:w="http://schemas.openxmlformats.org/wordprocessingml/2006/main" xmlns:w14="http://schemas.microsoft.com/office/word/2010/wordml" xmlns:w15="http://schemas.microsoft.com/office/word/2012/wordml" xmlns:w16cex="http://schemas.microsoft.com/office/word/2018/wordml/cex" xmlns:w16cid="http://schemas.microsoft.com/office/word/2016/wordml/cid" xmlns:w16="http://schemas.microsoft.com/office/word/2018/wordml" xmlns:w16du="http://schemas.microsoft.com/office/word/2023/wordml/word16du" xmlns:w16sdtdh="http://schemas.microsoft.com/office/word/2020/wordml/sdtdatahash" xmlns:w16sdtfl="http://schemas.microsoft.com/office/word/2024/wordml/sdtformatlock" xmlns:w16se="http://schemas.microsoft.com/office/word/2015/wordml/symex" xmlns:wpg="http://schemas.microsoft.com/office/word/2010/wordprocessingGroup" xmlns:wpi="http://schemas.microsoft.com/office/word/2010/wordprocessingInk" xmlns:wne="http://schemas.microsoft.com/office/word/2006/wordml" xmlns:wps="http://schemas.microsoft.com/office/word/2010/wordprocessingShape" mc:Ignorable="w14 w15 w16se w16cid w16 w16cex w16sdtdh w16sdtfl w16du wp14">
   <w:p>
     <w:pPr>
       <w:pStyle w:val="Header"/>
@@ -2107,7 +2065,7 @@
 </file>
 
 <file path=word/header2.xml><?xml version="1.0" encoding="utf-8"?>
-<w:hdr xmlns:wpc="http://schemas.microsoft.com/office/word/2010/wordprocessingCanvas" xmlns:cx="http://schemas.microsoft.com/office/drawing/2014/chartex" xmlns:cx1="http://schemas.microsoft.com/office/drawing/2015/9/8/chartex" xmlns:mc="http://schemas.openxmlformats.org/markup-compatibility/2006" xmlns:o="urn:schemas-microsoft-com:office:office" xmlns:r="http://schemas.openxmlformats.org/officeDocument/2006/relationships" xmlns:m="http://schemas.openxmlformats.org/officeDocument/2006/math" xmlns:v="urn:schemas-microsoft-com:vml" xmlns:wp14="http://schemas.microsoft.com/office/word/2010/wordprocessingDrawing" xmlns:wp="http://schemas.openxmlformats.org/drawingml/2006/wordprocessingDrawing" xmlns:w10="urn:schemas-microsoft-com:office:word" xmlns:w="http://schemas.openxmlformats.org/wordprocessingml/2006/main" xmlns:w14="http://schemas.microsoft.com/office/word/2010/wordml" xmlns:w15="http://schemas.microsoft.com/office/word/2012/wordml" xmlns:w16se="http://schemas.microsoft.com/office/word/2015/wordml/symex" xmlns:wpg="http://schemas.microsoft.com/office/word/2010/wordprocessingGroup" xmlns:wpi="http://schemas.microsoft.com/office/word/2010/wordprocessingInk" xmlns:wne="http://schemas.microsoft.com/office/word/2006/wordml" xmlns:wps="http://schemas.microsoft.com/office/word/2010/wordprocessingShape" mc:Ignorable="w14 w15 w16se wp14">
+<w:hdr xmlns:wpc="http://schemas.microsoft.com/office/word/2010/wordprocessingCanvas" xmlns:cx="http://schemas.microsoft.com/office/drawing/2014/chartex" xmlns:cx1="http://schemas.microsoft.com/office/drawing/2015/9/8/chartex" xmlns:cx2="http://schemas.microsoft.com/office/drawing/2015/10/21/chartex" xmlns:cx3="http://schemas.microsoft.com/office/drawing/2016/5/9/chartex" xmlns:cx4="http://schemas.microsoft.com/office/drawing/2016/5/10/chartex" xmlns:cx5="http://schemas.microsoft.com/office/drawing/2016/5/11/chartex" xmlns:cx6="http://schemas.microsoft.com/office/drawing/2016/5/12/chartex" xmlns:cx7="http://schemas.microsoft.com/office/drawing/2016/5/13/chartex" xmlns:cx8="http://schemas.microsoft.com/office/drawing/2016/5/14/chartex" xmlns:mc="http://schemas.openxmlformats.org/markup-compatibility/2006" xmlns:aink="http://schemas.microsoft.com/office/drawing/2016/ink" xmlns:am3d="http://schemas.microsoft.com/office/drawing/2017/model3d" xmlns:o="urn:schemas-microsoft-com:office:office" xmlns:oel="http://schemas.microsoft.com/office/2019/extlst" xmlns:r="http://schemas.openxmlformats.org/officeDocument/2006/relationships" xmlns:m="http://schemas.openxmlformats.org/officeDocument/2006/math" xmlns:v="urn:schemas-microsoft-com:vml" xmlns:wp14="http://schemas.microsoft.com/office/word/2010/wordprocessingDrawing" xmlns:wp="http://schemas.openxmlformats.org/drawingml/2006/wordprocessingDrawing" xmlns:w10="urn:schemas-microsoft-com:office:word" xmlns:w="http://schemas.openxmlformats.org/wordprocessingml/2006/main" xmlns:w14="http://schemas.microsoft.com/office/word/2010/wordml" xmlns:w15="http://schemas.microsoft.com/office/word/2012/wordml" xmlns:w16cex="http://schemas.microsoft.com/office/word/2018/wordml/cex" xmlns:w16cid="http://schemas.microsoft.com/office/word/2016/wordml/cid" xmlns:w16="http://schemas.microsoft.com/office/word/2018/wordml" xmlns:w16du="http://schemas.microsoft.com/office/word/2023/wordml/word16du" xmlns:w16sdtdh="http://schemas.microsoft.com/office/word/2020/wordml/sdtdatahash" xmlns:w16sdtfl="http://schemas.microsoft.com/office/word/2024/wordml/sdtformatlock" xmlns:w16se="http://schemas.microsoft.com/office/word/2015/wordml/symex" xmlns:wpg="http://schemas.microsoft.com/office/word/2010/wordprocessingGroup" xmlns:wpi="http://schemas.microsoft.com/office/word/2010/wordprocessingInk" xmlns:wne="http://schemas.microsoft.com/office/word/2006/wordml" xmlns:wps="http://schemas.microsoft.com/office/word/2010/wordprocessingShape" mc:Ignorable="w14 w15 w16se w16cid w16 w16cex w16sdtdh w16sdtfl w16du wp14">
   <w:p>
     <w:pPr>
       <w:pStyle w:val="Header"/>
@@ -2118,7 +2076,7 @@
 </file>
 
 <file path=word/header3.xml><?xml version="1.0" encoding="utf-8"?>
-<w:hdr xmlns:wpc="http://schemas.microsoft.com/office/word/2010/wordprocessingCanvas" xmlns:cx="http://schemas.microsoft.com/office/drawing/2014/chartex" xmlns:cx1="http://schemas.microsoft.com/office/drawing/2015/9/8/chartex" xmlns:mc="http://schemas.openxmlformats.org/markup-compatibility/2006" xmlns:o="urn:schemas-microsoft-com:office:office" xmlns:r="http://schemas.openxmlformats.org/officeDocument/2006/relationships" xmlns:m="http://schemas.openxmlformats.org/officeDocument/2006/math" xmlns:v="urn:schemas-microsoft-com:vml" xmlns:wp14="http://schemas.microsoft.com/office/word/2010/wordprocessingDrawing" xmlns:wp="http://schemas.openxmlformats.org/drawingml/2006/wordprocessingDrawing" xmlns:w10="urn:schemas-microsoft-com:office:word" xmlns:w="http://schemas.openxmlformats.org/wordprocessingml/2006/main" xmlns:w14="http://schemas.microsoft.com/office/word/2010/wordml" xmlns:w15="http://schemas.microsoft.com/office/word/2012/wordml" xmlns:w16se="http://schemas.microsoft.com/office/word/2015/wordml/symex" xmlns:wpg="http://schemas.microsoft.com/office/word/2010/wordprocessingGroup" xmlns:wpi="http://schemas.microsoft.com/office/word/2010/wordprocessingInk" xmlns:wne="http://schemas.microsoft.com/office/word/2006/wordml" xmlns:wps="http://schemas.microsoft.com/office/word/2010/wordprocessingShape" mc:Ignorable="w14 w15 w16se wp14">
+<w:hdr xmlns:wpc="http://schemas.microsoft.com/office/word/2010/wordprocessingCanvas" xmlns:cx="http://schemas.microsoft.com/office/drawing/2014/chartex" xmlns:cx1="http://schemas.microsoft.com/office/drawing/2015/9/8/chartex" xmlns:cx2="http://schemas.microsoft.com/office/drawing/2015/10/21/chartex" xmlns:cx3="http://schemas.microsoft.com/office/drawing/2016/5/9/chartex" xmlns:cx4="http://schemas.microsoft.com/office/drawing/2016/5/10/chartex" xmlns:cx5="http://schemas.microsoft.com/office/drawing/2016/5/11/chartex" xmlns:cx6="http://schemas.microsoft.com/office/drawing/2016/5/12/chartex" xmlns:cx7="http://schemas.microsoft.com/office/drawing/2016/5/13/chartex" xmlns:cx8="http://schemas.microsoft.com/office/drawing/2016/5/14/chartex" xmlns:mc="http://schemas.openxmlformats.org/markup-compatibility/2006" xmlns:aink="http://schemas.microsoft.com/office/drawing/2016/ink" xmlns:am3d="http://schemas.microsoft.com/office/drawing/2017/model3d" xmlns:o="urn:schemas-microsoft-com:office:office" xmlns:oel="http://schemas.microsoft.com/office/2019/extlst" xmlns:r="http://schemas.openxmlformats.org/officeDocument/2006/relationships" xmlns:m="http://schemas.openxmlformats.org/officeDocument/2006/math" xmlns:v="urn:schemas-microsoft-com:vml" xmlns:wp14="http://schemas.microsoft.com/office/word/2010/wordprocessingDrawing" xmlns:wp="http://schemas.openxmlformats.org/drawingml/2006/wordprocessingDrawing" xmlns:w10="urn:schemas-microsoft-com:office:word" xmlns:w="http://schemas.openxmlformats.org/wordprocessingml/2006/main" xmlns:w14="http://schemas.microsoft.com/office/word/2010/wordml" xmlns:w15="http://schemas.microsoft.com/office/word/2012/wordml" xmlns:w16cex="http://schemas.microsoft.com/office/word/2018/wordml/cex" xmlns:w16cid="http://schemas.microsoft.com/office/word/2016/wordml/cid" xmlns:w16="http://schemas.microsoft.com/office/word/2018/wordml" xmlns:w16du="http://schemas.microsoft.com/office/word/2023/wordml/word16du" xmlns:w16sdtdh="http://schemas.microsoft.com/office/word/2020/wordml/sdtdatahash" xmlns:w16sdtfl="http://schemas.microsoft.com/office/word/2024/wordml/sdtformatlock" xmlns:w16se="http://schemas.microsoft.com/office/word/2015/wordml/symex" xmlns:wpg="http://schemas.microsoft.com/office/word/2010/wordprocessingGroup" xmlns:wpi="http://schemas.microsoft.com/office/word/2010/wordprocessingInk" xmlns:wne="http://schemas.microsoft.com/office/word/2006/wordml" xmlns:wps="http://schemas.microsoft.com/office/word/2010/wordprocessingShape" mc:Ignorable="w14 w15 w16se w16cid w16 w16cex w16sdtdh w16sdtfl w16du wp14">
   <w:p>
     <w:pPr>
       <w:pStyle w:val="Header"/>
@@ -2129,7 +2087,7 @@
 </file>
 
 <file path=word/numbering.xml><?xml version="1.0" encoding="utf-8"?>
-<w:numbering xmlns:wpc="http://schemas.microsoft.com/office/word/2010/wordprocessingCanvas" xmlns:cx="http://schemas.microsoft.com/office/drawing/2014/chartex" xmlns:cx1="http://schemas.microsoft.com/office/drawing/2015/9/8/chartex" xmlns:mc="http://schemas.openxmlformats.org/markup-compatibility/2006" xmlns:o="urn:schemas-microsoft-com:office:office" xmlns:r="http://schemas.openxmlformats.org/officeDocument/2006/relationships" xmlns:m="http://schemas.openxmlformats.org/officeDocument/2006/math" xmlns:v="urn:schemas-microsoft-com:vml" xmlns:wp14="http://schemas.microsoft.com/office/word/2010/wordprocessingDrawing" xmlns:wp="http://schemas.openxmlformats.org/drawingml/2006/wordprocessingDrawing" xmlns:w10="urn:schemas-microsoft-com:office:word" xmlns:w="http://schemas.openxmlformats.org/wordprocessingml/2006/main" xmlns:w14="http://schemas.microsoft.com/office/word/2010/wordml" xmlns:w15="http://schemas.microsoft.com/office/word/2012/wordml" xmlns:w16se="http://schemas.microsoft.com/office/word/2015/wordml/symex" xmlns:wpg="http://schemas.microsoft.com/office/word/2010/wordprocessingGroup" xmlns:wpi="http://schemas.microsoft.com/office/word/2010/wordprocessingInk" xmlns:wne="http://schemas.microsoft.com/office/word/2006/wordml" xmlns:wps="http://schemas.microsoft.com/office/word/2010/wordprocessingShape" mc:Ignorable="w14 w15 w16se wp14">
+<w:numbering xmlns:wpc="http://schemas.microsoft.com/office/word/2010/wordprocessingCanvas" xmlns:cx="http://schemas.microsoft.com/office/drawing/2014/chartex" xmlns:cx1="http://schemas.microsoft.com/office/drawing/2015/9/8/chartex" xmlns:cx2="http://schemas.microsoft.com/office/drawing/2015/10/21/chartex" xmlns:cx3="http://schemas.microsoft.com/office/drawing/2016/5/9/chartex" xmlns:cx4="http://schemas.microsoft.com/office/drawing/2016/5/10/chartex" xmlns:cx5="http://schemas.microsoft.com/office/drawing/2016/5/11/chartex" xmlns:cx6="http://schemas.microsoft.com/office/drawing/2016/5/12/chartex" xmlns:cx7="http://schemas.microsoft.com/office/drawing/2016/5/13/chartex" xmlns:cx8="http://schemas.microsoft.com/office/drawing/2016/5/14/chartex" xmlns:mc="http://schemas.openxmlformats.org/markup-compatibility/2006" xmlns:aink="http://schemas.microsoft.com/office/drawing/2016/ink" xmlns:am3d="http://schemas.microsoft.com/office/drawing/2017/model3d" xmlns:o="urn:schemas-microsoft-com:office:office" xmlns:oel="http://schemas.microsoft.com/office/2019/extlst" xmlns:r="http://schemas.openxmlformats.org/officeDocument/2006/relationships" xmlns:m="http://schemas.openxmlformats.org/officeDocument/2006/math" xmlns:v="urn:schemas-microsoft-com:vml" xmlns:wp14="http://schemas.microsoft.com/office/word/2010/wordprocessingDrawing" xmlns:wp="http://schemas.openxmlformats.org/drawingml/2006/wordprocessingDrawing" xmlns:w10="urn:schemas-microsoft-com:office:word" xmlns:w="http://schemas.openxmlformats.org/wordprocessingml/2006/main" xmlns:w14="http://schemas.microsoft.com/office/word/2010/wordml" xmlns:w15="http://schemas.microsoft.com/office/word/2012/wordml" xmlns:w16cex="http://schemas.microsoft.com/office/word/2018/wordml/cex" xmlns:w16cid="http://schemas.microsoft.com/office/word/2016/wordml/cid" xmlns:w16="http://schemas.microsoft.com/office/word/2018/wordml" xmlns:w16du="http://schemas.microsoft.com/office/word/2023/wordml/word16du" xmlns:w16sdtdh="http://schemas.microsoft.com/office/word/2020/wordml/sdtdatahash" xmlns:w16sdtfl="http://schemas.microsoft.com/office/word/2024/wordml/sdtformatlock" xmlns:w16se="http://schemas.microsoft.com/office/word/2015/wordml/symex" xmlns:wpg="http://schemas.microsoft.com/office/word/2010/wordprocessingGroup" xmlns:wpi="http://schemas.microsoft.com/office/word/2010/wordprocessingInk" xmlns:wne="http://schemas.microsoft.com/office/word/2006/wordml" xmlns:wps="http://schemas.microsoft.com/office/word/2010/wordprocessingShape" mc:Ignorable="w14 w15 w16se w16cid w16 w16cex w16sdtdh w16sdtfl w16du wp14">
   <w:abstractNum w:abstractNumId="0" w15:restartNumberingAfterBreak="0">
     <w:nsid w:val="2DC06341"/>
     <w:multiLevelType w:val="multilevel"/>
@@ -2243,14 +2201,14 @@
       </w:pPr>
     </w:lvl>
   </w:abstractNum>
-  <w:num w:numId="1">
+  <w:num w:numId="1" w16cid:durableId="100616843">
     <w:abstractNumId w:val="0"/>
   </w:num>
 </w:numbering>
 </file>
 
 <file path=word/styles.xml><?xml version="1.0" encoding="utf-8"?>
-<w:styles xmlns:mc="http://schemas.openxmlformats.org/markup-compatibility/2006" xmlns:r="http://schemas.openxmlformats.org/officeDocument/2006/relationships" xmlns:w="http://schemas.openxmlformats.org/wordprocessingml/2006/main" xmlns:w14="http://schemas.microsoft.com/office/word/2010/wordml" xmlns:w15="http://schemas.microsoft.com/office/word/2012/wordml" xmlns:w16se="http://schemas.microsoft.com/office/word/2015/wordml/symex" mc:Ignorable="w14 w15 w16se">
+<w:styles xmlns:mc="http://schemas.openxmlformats.org/markup-compatibility/2006" xmlns:r="http://schemas.openxmlformats.org/officeDocument/2006/relationships" xmlns:w="http://schemas.openxmlformats.org/wordprocessingml/2006/main" xmlns:w14="http://schemas.microsoft.com/office/word/2010/wordml" xmlns:w15="http://schemas.microsoft.com/office/word/2012/wordml" xmlns:w16cex="http://schemas.microsoft.com/office/word/2018/wordml/cex" xmlns:w16cid="http://schemas.microsoft.com/office/word/2016/wordml/cid" xmlns:w16="http://schemas.microsoft.com/office/word/2018/wordml" xmlns:w16du="http://schemas.microsoft.com/office/word/2023/wordml/word16du" xmlns:w16sdtdh="http://schemas.microsoft.com/office/word/2020/wordml/sdtdatahash" xmlns:w16sdtfl="http://schemas.microsoft.com/office/word/2024/wordml/sdtformatlock" xmlns:w16se="http://schemas.microsoft.com/office/word/2015/wordml/symex" mc:Ignorable="w14 w15 w16se w16cid w16 w16cex w16sdtdh w16sdtfl w16du">
   <w:docDefaults>
     <w:rPrDefault>
       <w:rPr>
@@ -2266,7 +2224,7 @@
       </w:pPr>
     </w:pPrDefault>
   </w:docDefaults>
-  <w:latentStyles w:defLockedState="0" w:defUIPriority="99" w:defSemiHidden="0" w:defUnhideWhenUsed="0" w:defQFormat="0" w:count="371">
+  <w:latentStyles w:defLockedState="0" w:defUIPriority="99" w:defSemiHidden="0" w:defUnhideWhenUsed="0" w:defQFormat="0" w:count="376">
     <w:lsdException w:name="Normal" w:uiPriority="0" w:qFormat="1"/>
     <w:lsdException w:name="heading 1" w:uiPriority="9" w:qFormat="1"/>
     <w:lsdException w:name="heading 2" w:semiHidden="1" w:uiPriority="9" w:unhideWhenUsed="1" w:qFormat="1"/>
@@ -2638,6 +2596,11 @@
     <w:lsdException w:name="List Table 5 Dark Accent 6" w:uiPriority="50"/>
     <w:lsdException w:name="List Table 6 Colorful Accent 6" w:uiPriority="51"/>
     <w:lsdException w:name="List Table 7 Colorful Accent 6" w:uiPriority="52"/>
+    <w:lsdException w:name="Mention" w:semiHidden="1" w:unhideWhenUsed="1"/>
+    <w:lsdException w:name="Smart Hyperlink" w:semiHidden="1" w:unhideWhenUsed="1"/>
+    <w:lsdException w:name="Hashtag" w:semiHidden="1" w:unhideWhenUsed="1"/>
+    <w:lsdException w:name="Unresolved Mention" w:semiHidden="1" w:unhideWhenUsed="1"/>
+    <w:lsdException w:name="Smart Link" w:semiHidden="1" w:unhideWhenUsed="1"/>
   </w:latentStyles>
   <w:style w:type="paragraph" w:default="1" w:styleId="Normal">
     <w:name w:val="Normal"/>

</xml_diff>